<commit_message>
Mejora formato PDF de monitoreo
</commit_message>
<xml_diff>
--- a/docs/2. Módulo Monitoreo de Listas/Fase 12 - Mejora ejecutiva Monitoreo de Listas/Fase_12_Mejora_Ejecutiva_Monitoreo_Listas_SGRLA_IHSS.docx
+++ b/docs/2. Módulo Monitoreo de Listas/Fase 12 - Mejora ejecutiva Monitoreo de Listas/Fase_12_Mejora_Ejecutiva_Monitoreo_Listas_SGRLA_IHSS.docx
@@ -8,6 +8,7 @@
       </w:pPr>
       <w:r>
         <w:rPr>
+          <w:rFonts w:ascii="Calibri" w:hAnsi="Calibri"/>
           <w:b/>
           <w:color w:val="0B2545"/>
           <w:sz w:val="36"/>
@@ -21,6 +22,7 @@
       </w:pPr>
       <w:r>
         <w:rPr>
+          <w:rFonts w:ascii="Calibri" w:hAnsi="Calibri"/>
           <w:color w:val="1F4D78"/>
           <w:sz w:val="24"/>
         </w:rPr>
@@ -100,14 +102,8 @@
             <w:vAlign w:val="center"/>
           </w:tcPr>
           <w:p>
-            <w:r/>
             <w:r>
-              <w:rPr>
-                <w:rFonts w:ascii="Calibri" w:hAnsi="Calibri"/>
-                <w:b w:val="0"/>
-                <w:sz w:val="20"/>
-              </w:rPr>
-              <w:t>1.0</w:t>
+              <w:t>1.1</w:t>
             </w:r>
           </w:p>
         </w:tc>
@@ -136,14 +132,8 @@
             <w:vAlign w:val="center"/>
           </w:tcPr>
           <w:p>
-            <w:r/>
             <w:r>
-              <w:rPr>
-                <w:rFonts w:ascii="Calibri" w:hAnsi="Calibri"/>
-                <w:b w:val="0"/>
-                <w:sz w:val="20"/>
-              </w:rPr>
-              <w:t>Documento técnico para revisión y validación funcional</w:t>
+              <w:t>Documento técnico ajustado para validación funcional de Fase 12</w:t>
             </w:r>
           </w:p>
         </w:tc>
@@ -298,11 +288,17 @@
         <w:pStyle w:val="Heading1"/>
       </w:pPr>
       <w:r>
+        <w:rPr>
+          <w:rFonts w:ascii="Calibri" w:hAnsi="Calibri"/>
+        </w:rPr>
         <w:t>1. Objetivo</w:t>
       </w:r>
     </w:p>
     <w:p>
       <w:r>
+        <w:rPr>
+          <w:rFonts w:ascii="Calibri" w:hAnsi="Calibri"/>
+        </w:rPr>
         <w:t>Implementar una vista ejecutiva interna para el módulo Monitoreo de Listas, mejorando la lectura operativa de coincidencias, positivos manuales, motivos, estados y exportaciones, sin modificar la lógica de negocio aprobada ni conectar este módulo con Matrices de Riesgos.</w:t>
       </w:r>
     </w:p>
@@ -311,6 +307,9 @@
         <w:pStyle w:val="Heading1"/>
       </w:pPr>
       <w:r>
+        <w:rPr>
+          <w:rFonts w:ascii="Calibri" w:hAnsi="Calibri"/>
+        </w:rPr>
         <w:t>2. Alcance de la fase</w:t>
       </w:r>
     </w:p>
@@ -549,6 +548,9 @@
         <w:pStyle w:val="Heading1"/>
       </w:pPr>
       <w:r>
+        <w:rPr>
+          <w:rFonts w:ascii="Calibri" w:hAnsi="Calibri"/>
+        </w:rPr>
         <w:t>3. Cambios realizados</w:t>
       </w:r>
     </w:p>
@@ -823,6 +825,9 @@
         <w:pStyle w:val="Heading1"/>
       </w:pPr>
       <w:r>
+        <w:rPr>
+          <w:rFonts w:ascii="Calibri" w:hAnsi="Calibri"/>
+        </w:rPr>
         <w:t>4. Reglas funcionales confirmadas</w:t>
       </w:r>
     </w:p>
@@ -831,6 +836,9 @@
         <w:pStyle w:val="ListBullet"/>
       </w:pPr>
       <w:r>
+        <w:rPr>
+          <w:rFonts w:ascii="Calibri" w:hAnsi="Calibri"/>
+        </w:rPr>
         <w:t>Monitoreo de Listas gestiona coincidencias, positivos manuales, motivos, seguimientos y evidencias.</w:t>
       </w:r>
     </w:p>
@@ -839,6 +847,9 @@
         <w:pStyle w:val="ListBullet"/>
       </w:pPr>
       <w:r>
+        <w:rPr>
+          <w:rFonts w:ascii="Calibri" w:hAnsi="Calibri"/>
+        </w:rPr>
         <w:t>Matrices de Riesgos no consume registros de Monitoreo de Listas para crear matrices ni calcular riesgo.</w:t>
       </w:r>
     </w:p>
@@ -847,6 +858,9 @@
         <w:pStyle w:val="ListBullet"/>
       </w:pPr>
       <w:r>
+        <w:rPr>
+          <w:rFonts w:ascii="Calibri" w:hAnsi="Calibri"/>
+        </w:rPr>
         <w:t>Las exportaciones deben respetar la vista filtrada vigente del usuario.</w:t>
       </w:r>
     </w:p>
@@ -855,6 +869,9 @@
         <w:pStyle w:val="ListBullet"/>
       </w:pPr>
       <w:r>
+        <w:rPr>
+          <w:rFonts w:ascii="Calibri" w:hAnsi="Calibri"/>
+        </w:rPr>
         <w:t>Toda exportación debe registrar auditoría antes de entregar el archivo.</w:t>
       </w:r>
     </w:p>
@@ -863,6 +880,9 @@
         <w:pStyle w:val="ListBullet"/>
       </w:pPr>
       <w:r>
+        <w:rPr>
+          <w:rFonts w:ascii="Calibri" w:hAnsi="Calibri"/>
+        </w:rPr>
         <w:t>La búsqueda se mantiene automática para evitar botones innecesarios y mejorar la operación.</w:t>
       </w:r>
     </w:p>
@@ -871,6 +891,9 @@
         <w:pStyle w:val="Heading1"/>
       </w:pPr>
       <w:r>
+        <w:rPr>
+          <w:rFonts w:ascii="Calibri" w:hAnsi="Calibri"/>
+        </w:rPr>
         <w:t>5. Validaciones requeridas</w:t>
       </w:r>
     </w:p>
@@ -1145,6 +1168,9 @@
         <w:pStyle w:val="Heading1"/>
       </w:pPr>
       <w:r>
+        <w:rPr>
+          <w:rFonts w:ascii="Calibri" w:hAnsi="Calibri"/>
+        </w:rPr>
         <w:t>6. Pendientes controlados</w:t>
       </w:r>
     </w:p>
@@ -1311,12 +1337,239 @@
         <w:pStyle w:val="Heading1"/>
       </w:pPr>
       <w:r>
+        <w:rPr>
+          <w:rFonts w:ascii="Calibri" w:hAnsi="Calibri"/>
+        </w:rPr>
         <w:t>7. Cierre provisional</w:t>
       </w:r>
     </w:p>
     <w:p>
       <w:r>
+        <w:rPr>
+          <w:rFonts w:ascii="Calibri" w:hAnsi="Calibri"/>
+        </w:rPr>
         <w:t>La Fase 12 queda documentada como mejora ejecutiva de Monitoreo de Listas. Su cierre formal depende de la validación funcional final en navegador y de la aprobación de Javier Mejía. Esta fase no reabre fases anteriores ni modifica la independencia entre Monitoreo de Listas y Matrices de Riesgos.</w:t>
+      </w:r>
+    </w:p>
+    <w:p>
+      <w:pPr>
+        <w:pStyle w:val="Heading1"/>
+      </w:pPr>
+      <w:r>
+        <w:rPr>
+          <w:rFonts w:ascii="Calibri" w:hAnsi="Calibri"/>
+        </w:rPr>
+        <w:t>8. Ajuste de exportaci?n PDF formal</w:t>
+      </w:r>
+    </w:p>
+    <w:p>
+      <w:r>
+        <w:rPr>
+          <w:rFonts w:ascii="Calibri" w:hAnsi="Calibri"/>
+        </w:rPr>
+        <w:t>Se corrigi? el formato del PDF principal del listado de Monitoreo de Listas. El encabezado ahora ocupa todo el ancho de la p?gina en orientaci?n horizontal, incluye filtros aplicados, resumen ejecutivo y una tabla con mejor jerarqu?a visual.</w:t>
+      </w:r>
+    </w:p>
+    <w:tbl>
+      <w:tblPr>
+        <w:tblStyle w:val="TableGrid"/>
+        <w:tblW w:type="auto" w:w="0"/>
+        <w:tblLook w:firstColumn="1" w:firstRow="1" w:lastColumn="0" w:lastRow="0" w:noHBand="0" w:noVBand="1" w:val="04A0"/>
+      </w:tblPr>
+      <w:tblGrid>
+        <w:gridCol w:w="4680"/>
+        <w:gridCol w:w="4680"/>
+      </w:tblGrid>
+      <w:tr>
+        <w:tc>
+          <w:tcPr>
+            <w:tcW w:type="dxa" w:w="4680"/>
+            <w:shd w:fill="F2F4F7"/>
+          </w:tcPr>
+          <w:p>
+            <w:r/>
+            <w:r>
+              <w:rPr>
+                <w:rFonts w:ascii="Calibri" w:hAnsi="Calibri"/>
+                <w:b/>
+                <w:sz w:val="20"/>
+              </w:rPr>
+              <w:t>Elemento corregido</w:t>
+            </w:r>
+          </w:p>
+        </w:tc>
+        <w:tc>
+          <w:tcPr>
+            <w:tcW w:type="dxa" w:w="4680"/>
+            <w:shd w:fill="F2F4F7"/>
+          </w:tcPr>
+          <w:p>
+            <w:r/>
+            <w:r>
+              <w:rPr>
+                <w:rFonts w:ascii="Calibri" w:hAnsi="Calibri"/>
+                <w:b/>
+                <w:sz w:val="20"/>
+              </w:rPr>
+              <w:t>Resultado</w:t>
+            </w:r>
+          </w:p>
+        </w:tc>
+      </w:tr>
+      <w:tr>
+        <w:tc>
+          <w:tcPr>
+            <w:tcW w:type="dxa" w:w="4680"/>
+          </w:tcPr>
+          <w:p>
+            <w:r/>
+            <w:r>
+              <w:rPr>
+                <w:rFonts w:ascii="Calibri" w:hAnsi="Calibri"/>
+                <w:b w:val="0"/>
+                <w:sz w:val="20"/>
+              </w:rPr>
+              <w:t>Encabezado del PDF</w:t>
+            </w:r>
+          </w:p>
+        </w:tc>
+        <w:tc>
+          <w:tcPr>
+            <w:tcW w:type="dxa" w:w="4680"/>
+          </w:tcPr>
+          <w:p>
+            <w:r/>
+            <w:r>
+              <w:rPr>
+                <w:rFonts w:ascii="Calibri" w:hAnsi="Calibri"/>
+                <w:b w:val="0"/>
+                <w:sz w:val="20"/>
+              </w:rPr>
+              <w:t>Banda institucional completa, sin bloque visual cortado ni espacio blanco desbalanceado.</w:t>
+            </w:r>
+          </w:p>
+        </w:tc>
+      </w:tr>
+      <w:tr>
+        <w:tc>
+          <w:tcPr>
+            <w:tcW w:type="dxa" w:w="4680"/>
+          </w:tcPr>
+          <w:p>
+            <w:r/>
+            <w:r>
+              <w:rPr>
+                <w:rFonts w:ascii="Calibri" w:hAnsi="Calibri"/>
+                <w:b w:val="0"/>
+                <w:sz w:val="20"/>
+              </w:rPr>
+              <w:t>Resumen ejecutivo</w:t>
+            </w:r>
+          </w:p>
+        </w:tc>
+        <w:tc>
+          <w:tcPr>
+            <w:tcW w:type="dxa" w:w="4680"/>
+          </w:tcPr>
+          <w:p>
+            <w:r/>
+            <w:r>
+              <w:rPr>
+                <w:rFonts w:ascii="Calibri" w:hAnsi="Calibri"/>
+                <w:b w:val="0"/>
+                <w:sz w:val="20"/>
+              </w:rPr>
+              <w:t>Incluye registros filtrados, pendientes, registros con motivo y cerrados/pasivos.</w:t>
+            </w:r>
+          </w:p>
+        </w:tc>
+      </w:tr>
+      <w:tr>
+        <w:tc>
+          <w:tcPr>
+            <w:tcW w:type="dxa" w:w="4680"/>
+          </w:tcPr>
+          <w:p>
+            <w:r/>
+            <w:r>
+              <w:rPr>
+                <w:rFonts w:ascii="Calibri" w:hAnsi="Calibri"/>
+                <w:b w:val="0"/>
+                <w:sz w:val="20"/>
+              </w:rPr>
+              <w:t>Tabla principal</w:t>
+            </w:r>
+          </w:p>
+        </w:tc>
+        <w:tc>
+          <w:tcPr>
+            <w:tcW w:type="dxa" w:w="4680"/>
+          </w:tcPr>
+          <w:p>
+            <w:r/>
+            <w:r>
+              <w:rPr>
+                <w:rFonts w:ascii="Calibri" w:hAnsi="Calibri"/>
+                <w:b w:val="0"/>
+                <w:sz w:val="20"/>
+              </w:rPr>
+              <w:t>Encabezado azul, filas alternadas, salto de l?nea interno y pie de p?gina consistente.</w:t>
+            </w:r>
+          </w:p>
+        </w:tc>
+      </w:tr>
+      <w:tr>
+        <w:tc>
+          <w:tcPr>
+            <w:tcW w:type="dxa" w:w="4680"/>
+          </w:tcPr>
+          <w:p>
+            <w:r/>
+            <w:r>
+              <w:rPr>
+                <w:rFonts w:ascii="Calibri" w:hAnsi="Calibri"/>
+                <w:b w:val="0"/>
+                <w:sz w:val="20"/>
+              </w:rPr>
+              <w:t>Auditor?a</w:t>
+            </w:r>
+          </w:p>
+        </w:tc>
+        <w:tc>
+          <w:tcPr>
+            <w:tcW w:type="dxa" w:w="4680"/>
+          </w:tcPr>
+          <w:p>
+            <w:r/>
+            <w:r>
+              <w:rPr>
+                <w:rFonts w:ascii="Calibri" w:hAnsi="Calibri"/>
+                <w:b w:val="0"/>
+                <w:sz w:val="20"/>
+              </w:rPr>
+              <w:t>Se conserva el registro obligatorio de exportaci?n antes de guardar el archivo.</w:t>
+            </w:r>
+          </w:p>
+        </w:tc>
+      </w:tr>
+    </w:tbl>
+    <w:p>
+      <w:pPr>
+        <w:pStyle w:val="Heading1"/>
+      </w:pPr>
+      <w:r>
+        <w:rPr>
+          <w:rFonts w:ascii="Calibri" w:hAnsi="Calibri"/>
+        </w:rPr>
+        <w:t>9. Continuidad recomendada</w:t>
+      </w:r>
+    </w:p>
+    <w:p>
+      <w:r>
+        <w:rPr>
+          <w:rFonts w:ascii="Calibri" w:hAnsi="Calibri"/>
+        </w:rPr>
+        <w:t>La siguiente continuidad de esta mejora debe enfocarse en la vista de detalle lateral de Monitoreo de Listas: mostrar datos del sujeto, motivo registrado, seguimientos, evidencias y acciones disponibles en tarjetas separadas, manteniendo la b?squeda autom?tica y la exportaci?n filtrada.</w:t>
       </w:r>
     </w:p>
     <w:sectPr>
@@ -1338,7 +1591,7 @@
       <w:jc w:val="right"/>
     </w:pPr>
     <w:r>
-      <w:t>Fase 12 - Monitoreo de Listas | Javier Mejía</w:t>
+      <w:t>Fase 12 - Monitoreo de Listas | Javier Mej?a | Versi?n 1.1</w:t>
     </w:r>
   </w:p>
 </w:ftr>

</xml_diff>

<commit_message>
Mejora detalle ejecutivo de monitoreo
</commit_message>
<xml_diff>
--- a/docs/2. Módulo Monitoreo de Listas/Fase 12 - Mejora ejecutiva Monitoreo de Listas/Fase_12_Mejora_Ejecutiva_Monitoreo_Listas_SGRLA_IHSS.docx
+++ b/docs/2. Módulo Monitoreo de Listas/Fase 12 - Mejora ejecutiva Monitoreo de Listas/Fase_12_Mejora_Ejecutiva_Monitoreo_Listas_SGRLA_IHSS.docx
@@ -103,7 +103,7 @@
           </w:tcPr>
           <w:p>
             <w:r>
-              <w:t>1.1</w:t>
+              <w:t>1.2</w:t>
             </w:r>
           </w:p>
         </w:tc>
@@ -133,7 +133,7 @@
           </w:tcPr>
           <w:p>
             <w:r>
-              <w:t>Documento técnico ajustado para validación funcional de Fase 12</w:t>
+              <w:t>Documento t?cnico ajustado para validaci?n funcional de Fase 12</w:t>
             </w:r>
           </w:p>
         </w:tc>
@@ -1572,6 +1572,236 @@
         <w:t>La siguiente continuidad de esta mejora debe enfocarse en la vista de detalle lateral de Monitoreo de Listas: mostrar datos del sujeto, motivo registrado, seguimientos, evidencias y acciones disponibles en tarjetas separadas, manteniendo la b?squeda autom?tica y la exportaci?n filtrada.</w:t>
       </w:r>
     </w:p>
+    <w:p>
+      <w:pPr>
+        <w:pStyle w:val="Heading1"/>
+      </w:pPr>
+      <w:r>
+        <w:t>10. Detalle ejecutivo de coincidencias</w:t>
+      </w:r>
+    </w:p>
+    <w:p>
+      <w:r>
+        <w:t>Se redise?? el modal de detalle para mostrar informaci?n en tarjetas independientes antes de la tabla t?cnica. Esto permite que el usuario identifique r?pidamente el sujeto, documento, lista de coincidencia, estado operativo, total de coincidencias, empresas relacionadas y acci?n recomendada.</w:t>
+      </w:r>
+    </w:p>
+    <w:tbl>
+      <w:tblPr>
+        <w:tblStyle w:val="TableGrid"/>
+        <w:tblW w:type="auto" w:w="0"/>
+        <w:tblLook w:firstColumn="1" w:firstRow="1" w:lastColumn="0" w:lastRow="0" w:noHBand="0" w:noVBand="1" w:val="04A0"/>
+      </w:tblPr>
+      <w:tblGrid>
+        <w:gridCol w:w="4680"/>
+        <w:gridCol w:w="4680"/>
+      </w:tblGrid>
+      <w:tr>
+        <w:tc>
+          <w:tcPr>
+            <w:tcW w:type="dxa" w:w="4680"/>
+            <w:shd w:fill="F2F4F7"/>
+          </w:tcPr>
+          <w:p>
+            <w:r/>
+            <w:r>
+              <w:rPr>
+                <w:rFonts w:ascii="Calibri" w:hAnsi="Calibri"/>
+                <w:b/>
+                <w:sz w:val="20"/>
+              </w:rPr>
+              <w:t>Elemento</w:t>
+            </w:r>
+          </w:p>
+        </w:tc>
+        <w:tc>
+          <w:tcPr>
+            <w:tcW w:type="dxa" w:w="4680"/>
+            <w:shd w:fill="F2F4F7"/>
+          </w:tcPr>
+          <w:p>
+            <w:r/>
+            <w:r>
+              <w:rPr>
+                <w:rFonts w:ascii="Calibri" w:hAnsi="Calibri"/>
+                <w:b/>
+                <w:sz w:val="20"/>
+              </w:rPr>
+              <w:t>Resultado funcional</w:t>
+            </w:r>
+          </w:p>
+        </w:tc>
+      </w:tr>
+      <w:tr>
+        <w:tc>
+          <w:tcPr>
+            <w:tcW w:type="dxa" w:w="4680"/>
+          </w:tcPr>
+          <w:p>
+            <w:r/>
+            <w:r>
+              <w:rPr>
+                <w:rFonts w:ascii="Calibri" w:hAnsi="Calibri"/>
+                <w:b w:val="0"/>
+                <w:sz w:val="20"/>
+              </w:rPr>
+              <w:t>Tarjeta de sujeto identificado</w:t>
+            </w:r>
+          </w:p>
+        </w:tc>
+        <w:tc>
+          <w:tcPr>
+            <w:tcW w:type="dxa" w:w="4680"/>
+          </w:tcPr>
+          <w:p>
+            <w:r/>
+            <w:r>
+              <w:rPr>
+                <w:rFonts w:ascii="Calibri" w:hAnsi="Calibri"/>
+                <w:b w:val="0"/>
+                <w:sz w:val="20"/>
+              </w:rPr>
+              <w:t>Muestra nombre, identidad o n?mero de identificaci?n del registro seleccionado.</w:t>
+            </w:r>
+          </w:p>
+        </w:tc>
+      </w:tr>
+      <w:tr>
+        <w:tc>
+          <w:tcPr>
+            <w:tcW w:type="dxa" w:w="4680"/>
+          </w:tcPr>
+          <w:p>
+            <w:r/>
+            <w:r>
+              <w:rPr>
+                <w:rFonts w:ascii="Calibri" w:hAnsi="Calibri"/>
+                <w:b w:val="0"/>
+                <w:sz w:val="20"/>
+              </w:rPr>
+              <w:t>Tarjeta de lista de coincidencia</w:t>
+            </w:r>
+          </w:p>
+        </w:tc>
+        <w:tc>
+          <w:tcPr>
+            <w:tcW w:type="dxa" w:w="4680"/>
+          </w:tcPr>
+          <w:p>
+            <w:r/>
+            <w:r>
+              <w:rPr>
+                <w:rFonts w:ascii="Calibri" w:hAnsi="Calibri"/>
+                <w:b w:val="0"/>
+                <w:sz w:val="20"/>
+              </w:rPr>
+              <w:t>Destaca la lista fuente del registro para revisi?n r?pida.</w:t>
+            </w:r>
+          </w:p>
+        </w:tc>
+      </w:tr>
+      <w:tr>
+        <w:tc>
+          <w:tcPr>
+            <w:tcW w:type="dxa" w:w="4680"/>
+          </w:tcPr>
+          <w:p>
+            <w:r/>
+            <w:r>
+              <w:rPr>
+                <w:rFonts w:ascii="Calibri" w:hAnsi="Calibri"/>
+                <w:b w:val="0"/>
+                <w:sz w:val="20"/>
+              </w:rPr>
+              <w:t>Tarjeta de estado operativo</w:t>
+            </w:r>
+          </w:p>
+        </w:tc>
+        <w:tc>
+          <w:tcPr>
+            <w:tcW w:type="dxa" w:w="4680"/>
+          </w:tcPr>
+          <w:p>
+            <w:r/>
+            <w:r>
+              <w:rPr>
+                <w:rFonts w:ascii="Calibri" w:hAnsi="Calibri"/>
+                <w:b w:val="0"/>
+                <w:sz w:val="20"/>
+              </w:rPr>
+              <w:t>Muestra Pendiente, Con motivo o Cerrado/Pasivo usando la misma regla del listado.</w:t>
+            </w:r>
+          </w:p>
+        </w:tc>
+      </w:tr>
+      <w:tr>
+        <w:tc>
+          <w:tcPr>
+            <w:tcW w:type="dxa" w:w="4680"/>
+          </w:tcPr>
+          <w:p>
+            <w:r/>
+            <w:r>
+              <w:rPr>
+                <w:rFonts w:ascii="Calibri" w:hAnsi="Calibri"/>
+                <w:b w:val="0"/>
+                <w:sz w:val="20"/>
+              </w:rPr>
+              <w:t>Resumen operativo</w:t>
+            </w:r>
+          </w:p>
+        </w:tc>
+        <w:tc>
+          <w:tcPr>
+            <w:tcW w:type="dxa" w:w="4680"/>
+          </w:tcPr>
+          <w:p>
+            <w:r/>
+            <w:r>
+              <w:rPr>
+                <w:rFonts w:ascii="Calibri" w:hAnsi="Calibri"/>
+                <w:b w:val="0"/>
+                <w:sz w:val="20"/>
+              </w:rPr>
+              <w:t>Separa total de coincidencias, empresas relacionadas, PEP o relaci?n IHSS y acci?n recomendada.</w:t>
+            </w:r>
+          </w:p>
+        </w:tc>
+      </w:tr>
+      <w:tr>
+        <w:tc>
+          <w:tcPr>
+            <w:tcW w:type="dxa" w:w="4680"/>
+          </w:tcPr>
+          <w:p>
+            <w:r/>
+            <w:r>
+              <w:rPr>
+                <w:rFonts w:ascii="Calibri" w:hAnsi="Calibri"/>
+                <w:b w:val="0"/>
+                <w:sz w:val="20"/>
+              </w:rPr>
+              <w:t>Tabla t?cnica</w:t>
+            </w:r>
+          </w:p>
+        </w:tc>
+        <w:tc>
+          <w:tcPr>
+            <w:tcW w:type="dxa" w:w="4680"/>
+          </w:tcPr>
+          <w:p>
+            <w:r/>
+            <w:r>
+              <w:rPr>
+                <w:rFonts w:ascii="Calibri" w:hAnsi="Calibri"/>
+                <w:b w:val="0"/>
+                <w:sz w:val="20"/>
+              </w:rPr>
+              <w:t>Se conserva como soporte detallado, pero deja de ser la primera lectura visual del usuario.</w:t>
+            </w:r>
+          </w:p>
+        </w:tc>
+      </w:tr>
+    </w:tbl>
     <w:sectPr>
       <w:footerReference w:type="default" r:id="rId9"/>
       <w:pgSz w:w="12240" w:h="15840"/>
@@ -1591,7 +1821,7 @@
       <w:jc w:val="right"/>
     </w:pPr>
     <w:r>
-      <w:t>Fase 12 - Monitoreo de Listas | Javier Mej?a | Versi?n 1.1</w:t>
+      <w:t>Fase 12 - Monitoreo de Listas | Javier Mej?a | Versi?n 1.2</w:t>
     </w:r>
   </w:p>
 </w:ftr>

</xml_diff>

<commit_message>
Cierra Fase 12 de monitoreo ejecutivo
</commit_message>
<xml_diff>
--- a/docs/2. Módulo Monitoreo de Listas/Fase 12 - Mejora ejecutiva Monitoreo de Listas/Fase_12_Mejora_Ejecutiva_Monitoreo_Listas_SGRLA_IHSS.docx
+++ b/docs/2. Módulo Monitoreo de Listas/Fase 12 - Mejora ejecutiva Monitoreo de Listas/Fase_12_Mejora_Ejecutiva_Monitoreo_Listas_SGRLA_IHSS.docx
@@ -103,7 +103,7 @@
           </w:tcPr>
           <w:p>
             <w:r>
-              <w:t>1.2</w:t>
+              <w:t>1.3</w:t>
             </w:r>
           </w:p>
         </w:tc>
@@ -133,7 +133,7 @@
           </w:tcPr>
           <w:p>
             <w:r>
-              <w:t>Documento t?cnico ajustado para validaci?n funcional de Fase 12</w:t>
+              <w:t>Fase 12 aprobada y cerrada</w:t>
             </w:r>
           </w:p>
         </w:tc>
@@ -1345,10 +1345,7 @@
     </w:p>
     <w:p>
       <w:r>
-        <w:rPr>
-          <w:rFonts w:ascii="Calibri" w:hAnsi="Calibri"/>
-        </w:rPr>
-        <w:t>La Fase 12 queda documentada como mejora ejecutiva de Monitoreo de Listas. Su cierre formal depende de la validación funcional final en navegador y de la aprobación de Javier Mejía. Esta fase no reabre fases anteriores ni modifica la independencia entre Monitoreo de Listas y Matrices de Riesgos.</w:t>
+        <w:t>La Fase 12 queda aprobada y cerrada como mejora ejecutiva del m?dulo Monitoreo de Listas. Esta fase no reabre fases anteriores ni modifica la independencia entre Monitoreo de Listas y Matrices de Riesgos.</w:t>
       </w:r>
     </w:p>
     <w:p>
@@ -1802,6 +1799,270 @@
         </w:tc>
       </w:tr>
     </w:tbl>
+    <w:p>
+      <w:pPr>
+        <w:pStyle w:val="Heading1"/>
+      </w:pPr>
+      <w:r>
+        <w:t>11. Cierre formal de Fase 12</w:t>
+      </w:r>
+    </w:p>
+    <w:p>
+      <w:r>
+        <w:t>Por aprobaci?n de Javier Mej?a, la Fase 12 queda formalmente aprobada y cerrada. La mejora ejecutiva del m?dulo Monitoreo de Listas queda incorporada como base funcional del sistema, manteniendo la independencia total respecto al m?dulo Matrices de Riesgos.</w:t>
+      </w:r>
+    </w:p>
+    <w:tbl>
+      <w:tblPr>
+        <w:tblStyle w:val="TableGrid"/>
+        <w:tblW w:type="auto" w:w="0"/>
+        <w:tblLook w:firstColumn="1" w:firstRow="1" w:lastColumn="0" w:lastRow="0" w:noHBand="0" w:noVBand="1" w:val="04A0"/>
+      </w:tblPr>
+      <w:tblGrid>
+        <w:gridCol w:w="4680"/>
+        <w:gridCol w:w="4680"/>
+      </w:tblGrid>
+      <w:tr>
+        <w:tc>
+          <w:tcPr>
+            <w:tcW w:type="dxa" w:w="4680"/>
+            <w:shd w:fill="F2F4F7"/>
+          </w:tcPr>
+          <w:p>
+            <w:r/>
+            <w:r>
+              <w:rPr>
+                <w:rFonts w:ascii="Calibri" w:hAnsi="Calibri"/>
+                <w:b/>
+                <w:sz w:val="20"/>
+              </w:rPr>
+              <w:t>Elemento validado</w:t>
+            </w:r>
+          </w:p>
+        </w:tc>
+        <w:tc>
+          <w:tcPr>
+            <w:tcW w:type="dxa" w:w="4680"/>
+            <w:shd w:fill="F2F4F7"/>
+          </w:tcPr>
+          <w:p>
+            <w:r/>
+            <w:r>
+              <w:rPr>
+                <w:rFonts w:ascii="Calibri" w:hAnsi="Calibri"/>
+                <w:b/>
+                <w:sz w:val="20"/>
+              </w:rPr>
+              <w:t>Resultado de cierre</w:t>
+            </w:r>
+          </w:p>
+        </w:tc>
+      </w:tr>
+      <w:tr>
+        <w:tc>
+          <w:tcPr>
+            <w:tcW w:type="dxa" w:w="4680"/>
+          </w:tcPr>
+          <w:p>
+            <w:r/>
+            <w:r>
+              <w:rPr>
+                <w:rFonts w:ascii="Calibri" w:hAnsi="Calibri"/>
+                <w:b w:val="0"/>
+                <w:sz w:val="20"/>
+              </w:rPr>
+              <w:t>Vista ejecutiva</w:t>
+            </w:r>
+          </w:p>
+        </w:tc>
+        <w:tc>
+          <w:tcPr>
+            <w:tcW w:type="dxa" w:w="4680"/>
+          </w:tcPr>
+          <w:p>
+            <w:r/>
+            <w:r>
+              <w:rPr>
+                <w:rFonts w:ascii="Calibri" w:hAnsi="Calibri"/>
+                <w:b w:val="0"/>
+                <w:sz w:val="20"/>
+              </w:rPr>
+              <w:t>Aprobada con tarjetas KPI, vista seleccionada y distribuci?n por lista.</w:t>
+            </w:r>
+          </w:p>
+        </w:tc>
+      </w:tr>
+      <w:tr>
+        <w:tc>
+          <w:tcPr>
+            <w:tcW w:type="dxa" w:w="4680"/>
+          </w:tcPr>
+          <w:p>
+            <w:r/>
+            <w:r>
+              <w:rPr>
+                <w:rFonts w:ascii="Calibri" w:hAnsi="Calibri"/>
+                <w:b w:val="0"/>
+                <w:sz w:val="20"/>
+              </w:rPr>
+              <w:t>Filtros</w:t>
+            </w:r>
+          </w:p>
+        </w:tc>
+        <w:tc>
+          <w:tcPr>
+            <w:tcW w:type="dxa" w:w="4680"/>
+          </w:tcPr>
+          <w:p>
+            <w:r/>
+            <w:r>
+              <w:rPr>
+                <w:rFonts w:ascii="Calibri" w:hAnsi="Calibri"/>
+                <w:b w:val="0"/>
+                <w:sz w:val="20"/>
+              </w:rPr>
+              <w:t>Aprobados con b?squeda autom?tica, fechas, estado, limpieza y cantidad de registros.</w:t>
+            </w:r>
+          </w:p>
+        </w:tc>
+      </w:tr>
+      <w:tr>
+        <w:tc>
+          <w:tcPr>
+            <w:tcW w:type="dxa" w:w="4680"/>
+          </w:tcPr>
+          <w:p>
+            <w:r/>
+            <w:r>
+              <w:rPr>
+                <w:rFonts w:ascii="Calibri" w:hAnsi="Calibri"/>
+                <w:b w:val="0"/>
+                <w:sz w:val="20"/>
+              </w:rPr>
+              <w:t>Exportaciones</w:t>
+            </w:r>
+          </w:p>
+        </w:tc>
+        <w:tc>
+          <w:tcPr>
+            <w:tcW w:type="dxa" w:w="4680"/>
+          </w:tcPr>
+          <w:p>
+            <w:r/>
+            <w:r>
+              <w:rPr>
+                <w:rFonts w:ascii="Calibri" w:hAnsi="Calibri"/>
+                <w:b w:val="0"/>
+                <w:sz w:val="20"/>
+              </w:rPr>
+              <w:t>Aprobadas con Excel y PDF filtrados, conservando auditor?a obligatoria.</w:t>
+            </w:r>
+          </w:p>
+        </w:tc>
+      </w:tr>
+      <w:tr>
+        <w:tc>
+          <w:tcPr>
+            <w:tcW w:type="dxa" w:w="4680"/>
+          </w:tcPr>
+          <w:p>
+            <w:r/>
+            <w:r>
+              <w:rPr>
+                <w:rFonts w:ascii="Calibri" w:hAnsi="Calibri"/>
+                <w:b w:val="0"/>
+                <w:sz w:val="20"/>
+              </w:rPr>
+              <w:t>Detalle de coincidencia</w:t>
+            </w:r>
+          </w:p>
+        </w:tc>
+        <w:tc>
+          <w:tcPr>
+            <w:tcW w:type="dxa" w:w="4680"/>
+          </w:tcPr>
+          <w:p>
+            <w:r/>
+            <w:r>
+              <w:rPr>
+                <w:rFonts w:ascii="Calibri" w:hAnsi="Calibri"/>
+                <w:b w:val="0"/>
+                <w:sz w:val="20"/>
+              </w:rPr>
+              <w:t>Aprobado con tarjetas separadas y tabla t?cnica como soporte.</w:t>
+            </w:r>
+          </w:p>
+        </w:tc>
+      </w:tr>
+      <w:tr>
+        <w:tc>
+          <w:tcPr>
+            <w:tcW w:type="dxa" w:w="4680"/>
+          </w:tcPr>
+          <w:p>
+            <w:r/>
+            <w:r>
+              <w:rPr>
+                <w:rFonts w:ascii="Calibri" w:hAnsi="Calibri"/>
+                <w:b w:val="0"/>
+                <w:sz w:val="20"/>
+              </w:rPr>
+              <w:t>Separaci?n modular</w:t>
+            </w:r>
+          </w:p>
+        </w:tc>
+        <w:tc>
+          <w:tcPr>
+            <w:tcW w:type="dxa" w:w="4680"/>
+          </w:tcPr>
+          <w:p>
+            <w:r/>
+            <w:r>
+              <w:rPr>
+                <w:rFonts w:ascii="Calibri" w:hAnsi="Calibri"/>
+                <w:b w:val="0"/>
+                <w:sz w:val="20"/>
+              </w:rPr>
+              <w:t>Confirmada: Monitoreo de Listas no se conecta funcionalmente con Matrices de Riesgos.</w:t>
+            </w:r>
+          </w:p>
+        </w:tc>
+      </w:tr>
+      <w:tr>
+        <w:tc>
+          <w:tcPr>
+            <w:tcW w:type="dxa" w:w="4680"/>
+          </w:tcPr>
+          <w:p>
+            <w:r/>
+            <w:r>
+              <w:rPr>
+                <w:rFonts w:ascii="Calibri" w:hAnsi="Calibri"/>
+                <w:b w:val="0"/>
+                <w:sz w:val="20"/>
+              </w:rPr>
+              <w:t>Continuidad</w:t>
+            </w:r>
+          </w:p>
+        </w:tc>
+        <w:tc>
+          <w:tcPr>
+            <w:tcW w:type="dxa" w:w="4680"/>
+          </w:tcPr>
+          <w:p>
+            <w:r/>
+            <w:r>
+              <w:rPr>
+                <w:rFonts w:ascii="Calibri" w:hAnsi="Calibri"/>
+                <w:b w:val="0"/>
+                <w:sz w:val="20"/>
+              </w:rPr>
+              <w:t>Las mejoras futuras deber?n tratarse como mantenimiento evolutivo o nueva fase autorizada.</w:t>
+            </w:r>
+          </w:p>
+        </w:tc>
+      </w:tr>
+    </w:tbl>
     <w:sectPr>
       <w:footerReference w:type="default" r:id="rId9"/>
       <w:pgSz w:w="12240" w:h="15840"/>
@@ -1821,7 +2082,7 @@
       <w:jc w:val="right"/>
     </w:pPr>
     <w:r>
-      <w:t>Fase 12 - Monitoreo de Listas | Javier Mej?a | Versi?n 1.2</w:t>
+      <w:t>Fase 12 - Monitoreo de Listas | Javier Mej?a | Versi?n 1.3 | Aprobada y cerrada</w:t>
     </w:r>
   </w:p>
 </w:ftr>

</xml_diff>